<commit_message>
removed bug from the critic agent
</commit_message>
<xml_diff>
--- a/VeriMind_Report.docx
+++ b/VeriMind_Report.docx
@@ -1268,976 +1268,16 @@
           <w:szCs w:val="28"/>
           <w:lang w:val="en-IN" w:eastAsia="en-IN" w:bidi="mr-IN"/>
         </w:rPr>
-        <w:t>for their support.</w:t>
-      </w:r>
-    </w:p>
-    <w:p>
-      <w:pPr>
-        <w:spacing w:before="60" w:after="160" w:line="259" w:lineRule="auto"/>
-        <w:ind w:left="589" w:right="946"/>
-        <w:rPr>
-          <w:rFonts w:ascii="Calibri" w:eastAsia="Calibri" w:hAnsi="Calibri" w:cs="Calibri"/>
+        <w:t>for their suppor</w:t>
+      </w:r>
+      <w:r>
+        <w:rPr>
+          <w:color w:val="000000"/>
+          <w:sz w:val="28"/>
+          <w:szCs w:val="28"/>
           <w:lang w:val="en-IN" w:eastAsia="en-IN" w:bidi="mr-IN"/>
         </w:rPr>
-      </w:pPr>
-      <w:r>
-        <w:rPr>
-          <w:rFonts w:ascii="Calibri" w:eastAsia="Calibri" w:hAnsi="Calibri" w:cs="Calibri"/>
-          <w:lang w:val="en-IN" w:eastAsia="en-IN" w:bidi="mr-IN"/>
-        </w:rPr>
-        <w:lastRenderedPageBreak/>
-        <w:t>(Note: All entries of the proforma of approval should be filled up with appropriate and complete information of approval in any respect will be summarily rejected.)</w:t>
-      </w:r>
-    </w:p>
-    <w:p>
-      <w:pPr>
-        <w:widowControl w:val="0"/>
-        <w:pBdr>
-          <w:top w:val="nil"/>
-          <w:left w:val="nil"/>
-          <w:bottom w:val="nil"/>
-          <w:right w:val="nil"/>
-          <w:between w:val="nil"/>
-        </w:pBdr>
-        <w:rPr>
-          <w:color w:val="000000"/>
-          <w:sz w:val="20"/>
-          <w:szCs w:val="20"/>
-          <w:lang w:val="en-IN" w:eastAsia="en-IN" w:bidi="mr-IN"/>
-        </w:rPr>
-        <w:sectPr>
-          <w:pgSz w:w="11920" w:h="16840"/>
-          <w:pgMar w:top="1380" w:right="566" w:bottom="280" w:left="566" w:header="720" w:footer="720" w:gutter="0"/>
-          <w:cols w:space="720"/>
-        </w:sectPr>
-      </w:pPr>
-    </w:p>
-    <w:p>
-      <w:pPr>
-        <w:widowControl w:val="0"/>
-        <w:numPr>
-          <w:ilvl w:val="0"/>
-          <w:numId w:val="1"/>
-        </w:numPr>
-        <w:pBdr>
-          <w:top w:val="nil"/>
-          <w:left w:val="nil"/>
-          <w:bottom w:val="nil"/>
-          <w:right w:val="nil"/>
-          <w:between w:val="nil"/>
-        </w:pBdr>
-        <w:tabs>
-          <w:tab w:val="left" w:pos="588"/>
-        </w:tabs>
-        <w:spacing w:before="90"/>
-        <w:ind w:left="588"/>
-        <w:rPr>
-          <w:rFonts w:ascii="Calibri" w:eastAsia="Calibri" w:hAnsi="Calibri" w:cs="Calibri"/>
-          <w:color w:val="000000"/>
-          <w:lang w:val="en-IN" w:eastAsia="en-IN" w:bidi="mr-IN"/>
-        </w:rPr>
-      </w:pPr>
-      <w:r>
-        <w:rPr>
-          <w:rFonts w:ascii="Calibri" w:eastAsia="Calibri" w:hAnsi="Calibri" w:cs="Calibri"/>
-          <w:color w:val="000000"/>
-          <w:lang w:val="en-IN" w:eastAsia="en-IN" w:bidi="mr-IN"/>
-        </w:rPr>
-        <w:t>Name of the Student With Group:</w:t>
-      </w:r>
-    </w:p>
-    <w:p>
-      <w:pPr>
-        <w:spacing w:before="112" w:after="160" w:line="259" w:lineRule="auto"/>
-        <w:rPr>
-          <w:rFonts w:ascii="Calibri" w:eastAsia="Calibri" w:hAnsi="Calibri" w:cs="Calibri"/>
-          <w:lang w:val="en-IN" w:eastAsia="en-IN" w:bidi="mr-IN"/>
-        </w:rPr>
-      </w:pPr>
-      <w:r>
-        <w:rPr>
-          <w:rFonts w:ascii="Calibri" w:eastAsia="Calibri" w:hAnsi="Calibri" w:cs="Calibri"/>
-          <w:sz w:val="22"/>
-          <w:szCs w:val="22"/>
-          <w:lang w:val="en-IN" w:eastAsia="en-IN" w:bidi="mr-IN"/>
-        </w:rPr>
-        <w:br w:type="column"/>
-      </w:r>
-    </w:p>
-    <w:p>
-      <w:pPr>
-        <w:widowControl w:val="0"/>
-        <w:numPr>
-          <w:ilvl w:val="1"/>
-          <w:numId w:val="1"/>
-        </w:numPr>
-        <w:pBdr>
-          <w:top w:val="nil"/>
-          <w:left w:val="nil"/>
-          <w:bottom w:val="nil"/>
-          <w:right w:val="nil"/>
-          <w:between w:val="nil"/>
-        </w:pBdr>
-        <w:tabs>
-          <w:tab w:val="left" w:pos="548"/>
-        </w:tabs>
-        <w:ind w:left="548" w:hanging="306"/>
-        <w:rPr>
-          <w:rFonts w:ascii="Calibri" w:eastAsia="Calibri" w:hAnsi="Calibri" w:cs="Calibri"/>
-          <w:color w:val="000000"/>
-          <w:sz w:val="22"/>
-          <w:szCs w:val="22"/>
-          <w:lang w:val="en-IN" w:eastAsia="en-IN" w:bidi="mr-IN"/>
-        </w:rPr>
-        <w:sectPr>
-          <w:type w:val="continuous"/>
-          <w:pgSz w:w="11920" w:h="16840"/>
-          <w:pgMar w:top="1380" w:right="566" w:bottom="280" w:left="566" w:header="720" w:footer="720" w:gutter="0"/>
-          <w:cols w:num="2" w:space="720" w:equalWidth="0">
-            <w:col w:w="3931" w:space="2926"/>
-            <w:col w:w="3931" w:space="0"/>
-          </w:cols>
-        </w:sectPr>
-      </w:pPr>
-      <w:r>
-        <w:rPr>
-          <w:rFonts w:ascii="Calibri" w:eastAsia="Calibri" w:hAnsi="Calibri" w:cs="Calibri"/>
-          <w:color w:val="000000"/>
-          <w:lang w:val="en-IN" w:eastAsia="en-IN" w:bidi="mr-IN"/>
-        </w:rPr>
-        <w:t>ADITYA PAWAR</w:t>
-      </w:r>
-    </w:p>
-    <w:p>
-      <w:pPr>
-        <w:widowControl w:val="0"/>
-        <w:pBdr>
-          <w:top w:val="nil"/>
-          <w:left w:val="nil"/>
-          <w:bottom w:val="nil"/>
-          <w:right w:val="nil"/>
-          <w:between w:val="nil"/>
-        </w:pBdr>
-        <w:spacing w:before="44"/>
-        <w:rPr>
-          <w:color w:val="000000"/>
-          <w:lang w:val="en-IN" w:eastAsia="en-IN" w:bidi="mr-IN"/>
-        </w:rPr>
-      </w:pPr>
-    </w:p>
-    <w:p>
-      <w:pPr>
-        <w:widowControl w:val="0"/>
-        <w:numPr>
-          <w:ilvl w:val="0"/>
-          <w:numId w:val="1"/>
-        </w:numPr>
-        <w:pBdr>
-          <w:top w:val="nil"/>
-          <w:left w:val="nil"/>
-          <w:bottom w:val="nil"/>
-          <w:right w:val="nil"/>
-          <w:between w:val="nil"/>
-        </w:pBdr>
-        <w:tabs>
-          <w:tab w:val="left" w:pos="588"/>
-          <w:tab w:val="left" w:pos="5193"/>
-        </w:tabs>
-        <w:ind w:left="588"/>
-        <w:rPr>
-          <w:rFonts w:ascii="Calibri" w:eastAsia="Calibri" w:hAnsi="Calibri" w:cs="Calibri"/>
-          <w:b/>
-          <w:bCs/>
-          <w:color w:val="000000"/>
-          <w:lang w:val="en-IN" w:eastAsia="en-IN" w:bidi="mr-IN"/>
-        </w:rPr>
-      </w:pPr>
-      <w:r>
-        <w:rPr>
-          <w:rFonts w:ascii="Calibri" w:eastAsia="Calibri" w:hAnsi="Calibri" w:cs="Calibri"/>
-          <w:color w:val="000000"/>
-          <w:lang w:val="en-IN" w:eastAsia="en-IN" w:bidi="mr-IN"/>
-        </w:rPr>
-        <w:t>Title of the Project :</w:t>
-      </w:r>
-      <w:r>
-        <w:rPr>
-          <w:rFonts w:ascii="Calibri" w:eastAsia="Calibri" w:hAnsi="Calibri" w:cs="Calibri"/>
-          <w:color w:val="000000"/>
-          <w:lang w:val="en-IN" w:eastAsia="en-IN" w:bidi="mr-IN"/>
-        </w:rPr>
-        <w:tab/>
-      </w:r>
-      <w:r>
-        <w:rPr>
-          <w:rFonts w:ascii="Calibri" w:eastAsia="Calibri" w:hAnsi="Calibri" w:cs="Calibri"/>
-          <w:color w:val="000000"/>
-          <w:lang w:val="en-IN" w:eastAsia="en-IN" w:bidi="mr-IN"/>
-        </w:rPr>
-        <w:t xml:space="preserve">AI-Powered Multi-Agent Knowledge Verification and </w:t>
-      </w:r>
-      <w:r>
-        <w:rPr>
-          <w:rFonts w:ascii="Calibri" w:eastAsia="Calibri" w:hAnsi="Calibri" w:cs="Calibri"/>
-          <w:color w:val="000000"/>
-          <w:lang w:val="en-IN" w:eastAsia="en-IN" w:bidi="mr-IN"/>
-        </w:rPr>
-        <w:tab/>
-      </w:r>
-      <w:r>
-        <w:rPr>
-          <w:rFonts w:ascii="Calibri" w:eastAsia="Calibri" w:hAnsi="Calibri" w:cs="Calibri"/>
-          <w:color w:val="000000"/>
-          <w:lang w:val="en-IN" w:eastAsia="en-IN" w:bidi="mr-IN"/>
-        </w:rPr>
-        <w:t>Document Intelligence Platform</w:t>
-      </w:r>
-    </w:p>
-    <w:p>
-      <w:pPr>
-        <w:widowControl w:val="0"/>
-        <w:pBdr>
-          <w:top w:val="nil"/>
-          <w:left w:val="nil"/>
-          <w:bottom w:val="nil"/>
-          <w:right w:val="nil"/>
-          <w:between w:val="nil"/>
-        </w:pBdr>
-        <w:tabs>
-          <w:tab w:val="left" w:pos="588"/>
-          <w:tab w:val="left" w:pos="5193"/>
-        </w:tabs>
-        <w:ind w:left="588"/>
-        <w:rPr>
-          <w:rFonts w:ascii="Calibri" w:eastAsia="Calibri" w:hAnsi="Calibri" w:cs="Calibri"/>
-          <w:b/>
-          <w:bCs/>
-          <w:color w:val="000000"/>
-          <w:lang w:val="en-IN" w:eastAsia="en-IN" w:bidi="mr-IN"/>
-        </w:rPr>
-      </w:pPr>
-    </w:p>
-    <w:p>
-      <w:pPr>
-        <w:widowControl w:val="0"/>
-        <w:pBdr>
-          <w:top w:val="nil"/>
-          <w:left w:val="nil"/>
-          <w:bottom w:val="nil"/>
-          <w:right w:val="nil"/>
-          <w:between w:val="nil"/>
-        </w:pBdr>
-        <w:spacing w:before="44"/>
-        <w:rPr>
-          <w:b/>
-          <w:bCs/>
-          <w:color w:val="000000"/>
-          <w:lang w:val="en-IN" w:eastAsia="en-IN" w:bidi="mr-IN"/>
-        </w:rPr>
-      </w:pPr>
-    </w:p>
-    <w:p>
-      <w:pPr>
-        <w:widowControl w:val="0"/>
-        <w:numPr>
-          <w:ilvl w:val="0"/>
-          <w:numId w:val="1"/>
-        </w:numPr>
-        <w:pBdr>
-          <w:top w:val="nil"/>
-          <w:left w:val="nil"/>
-          <w:bottom w:val="nil"/>
-          <w:right w:val="nil"/>
-          <w:between w:val="nil"/>
-        </w:pBdr>
-        <w:tabs>
-          <w:tab w:val="left" w:pos="588"/>
-          <w:tab w:val="left" w:pos="5313"/>
-        </w:tabs>
-        <w:ind w:left="588"/>
-        <w:rPr>
-          <w:rFonts w:ascii="Calibri" w:eastAsia="Calibri" w:hAnsi="Calibri" w:cs="Calibri"/>
-          <w:color w:val="000000"/>
-          <w:lang w:val="en-IN" w:eastAsia="en-IN" w:bidi="mr-IN"/>
-        </w:rPr>
-      </w:pPr>
-      <w:r>
-        <w:rPr>
-          <w:rFonts w:ascii="Calibri" w:eastAsia="Calibri" w:hAnsi="Calibri" w:cs="Calibri"/>
-          <w:color w:val="000000"/>
-          <w:lang w:val="en-IN" w:eastAsia="en-IN" w:bidi="mr-IN"/>
-        </w:rPr>
-        <w:t>Name and Address of the Guide :</w:t>
-      </w:r>
-      <w:r>
-        <w:rPr>
-          <w:rFonts w:ascii="Calibri" w:eastAsia="Calibri" w:hAnsi="Calibri" w:cs="Calibri"/>
-          <w:color w:val="000000"/>
-          <w:lang w:val="en-IN" w:eastAsia="en-IN" w:bidi="mr-IN"/>
-        </w:rPr>
-        <w:tab/>
-      </w:r>
-      <w:r>
-        <w:rPr>
-          <w:rFonts w:ascii="Calibri" w:eastAsia="Calibri" w:hAnsi="Calibri" w:cs="Calibri"/>
-          <w:b/>
-          <w:bCs/>
-          <w:color w:val="000000"/>
-          <w:lang w:val="en-IN" w:eastAsia="en-IN" w:bidi="mr-IN"/>
-        </w:rPr>
-        <w:t>Mr. Mahendra Datta.</w:t>
-      </w:r>
-    </w:p>
-    <w:p>
-      <w:pPr>
-        <w:widowControl w:val="0"/>
-        <w:pBdr>
-          <w:top w:val="nil"/>
-          <w:left w:val="nil"/>
-          <w:bottom w:val="nil"/>
-          <w:right w:val="nil"/>
-          <w:between w:val="nil"/>
-        </w:pBdr>
-        <w:spacing w:before="4"/>
-        <w:rPr>
-          <w:b/>
-          <w:bCs/>
-          <w:color w:val="000000"/>
-          <w:sz w:val="11"/>
-          <w:szCs w:val="11"/>
-          <w:lang w:val="en-IN" w:eastAsia="en-IN" w:bidi="mr-IN"/>
-        </w:rPr>
-      </w:pPr>
-      <w:r>
-        <w:rPr>
-          <w:noProof/>
-        </w:rPr>
-        <w:drawing>
-          <wp:anchor distT="0" distB="0" distL="0" distR="0" simplePos="0" relativeHeight="251660288" behindDoc="0" locked="0" layoutInCell="1" allowOverlap="1" wp14:anchorId="715AEA81" wp14:editId="47E346F5">
-            <wp:simplePos x="0" y="0"/>
-            <wp:positionH relativeFrom="column">
-              <wp:posOffset>3361445</wp:posOffset>
-            </wp:positionH>
-            <wp:positionV relativeFrom="paragraph">
-              <wp:posOffset>98146</wp:posOffset>
-            </wp:positionV>
-            <wp:extent cx="3015403" cy="663511"/>
-            <wp:effectExtent l="0" t="0" r="0" b="0"/>
-            <wp:wrapTopAndBottom/>
-            <wp:docPr id="50" name="image48.png"/>
-            <wp:cNvGraphicFramePr/>
-            <a:graphic xmlns:a="http://schemas.openxmlformats.org/drawingml/2006/main">
-              <a:graphicData uri="http://schemas.openxmlformats.org/drawingml/2006/picture">
-                <pic:pic xmlns:pic="http://schemas.openxmlformats.org/drawingml/2006/picture">
-                  <pic:nvPicPr>
-                    <pic:cNvPr id="50" name="image48.png"/>
-                    <pic:cNvPicPr/>
-                  </pic:nvPicPr>
-                  <pic:blipFill>
-                    <a:blip r:embed="rId10"/>
-                    <a:stretch>
-                      <a:fillRect/>
-                    </a:stretch>
-                  </pic:blipFill>
-                  <pic:spPr>
-                    <a:xfrm>
-                      <a:off x="0" y="0"/>
-                      <a:ext cx="3015403" cy="663511"/>
-                    </a:xfrm>
-                    <a:prstGeom prst="rect">
-                      <a:avLst/>
-                    </a:prstGeom>
-                  </pic:spPr>
-                </pic:pic>
-              </a:graphicData>
-            </a:graphic>
-          </wp:anchor>
-        </w:drawing>
-      </w:r>
-    </w:p>
-    <w:p>
-      <w:pPr>
-        <w:widowControl w:val="0"/>
-        <w:pBdr>
-          <w:top w:val="nil"/>
-          <w:left w:val="nil"/>
-          <w:bottom w:val="nil"/>
-          <w:right w:val="nil"/>
-          <w:between w:val="nil"/>
-        </w:pBdr>
-        <w:spacing w:before="193"/>
-        <w:rPr>
-          <w:b/>
-          <w:bCs/>
-          <w:color w:val="000000"/>
-          <w:lang w:val="en-IN" w:eastAsia="en-IN" w:bidi="mr-IN"/>
-        </w:rPr>
-      </w:pPr>
-    </w:p>
-    <w:p>
-      <w:pPr>
-        <w:widowControl w:val="0"/>
-        <w:numPr>
-          <w:ilvl w:val="0"/>
-          <w:numId w:val="1"/>
-        </w:numPr>
-        <w:pBdr>
-          <w:top w:val="nil"/>
-          <w:left w:val="nil"/>
-          <w:bottom w:val="nil"/>
-          <w:right w:val="nil"/>
-          <w:between w:val="nil"/>
-        </w:pBdr>
-        <w:tabs>
-          <w:tab w:val="left" w:pos="588"/>
-          <w:tab w:val="left" w:pos="5193"/>
-          <w:tab w:val="left" w:pos="5973"/>
-          <w:tab w:val="left" w:pos="9510"/>
-        </w:tabs>
-        <w:spacing w:before="7"/>
-        <w:ind w:left="588"/>
-        <w:rPr>
-          <w:color w:val="000000"/>
-          <w:sz w:val="20"/>
-          <w:szCs w:val="20"/>
-          <w:lang w:val="en-IN" w:eastAsia="en-IN" w:bidi="mr-IN"/>
-        </w:rPr>
-      </w:pPr>
-      <w:r>
-        <w:rPr>
-          <w:rFonts w:ascii="Calibri" w:eastAsia="Calibri" w:hAnsi="Calibri" w:cs="Calibri"/>
-          <w:color w:val="000000"/>
-          <w:lang w:val="en-IN" w:eastAsia="en-IN" w:bidi="mr-IN"/>
-        </w:rPr>
-        <w:t>Educational Qualification of the Guide :</w:t>
-      </w:r>
-      <w:r>
-        <w:rPr>
-          <w:rFonts w:ascii="Calibri" w:eastAsia="Calibri" w:hAnsi="Calibri" w:cs="Calibri"/>
-          <w:color w:val="000000"/>
-          <w:lang w:val="en-IN" w:eastAsia="en-IN" w:bidi="mr-IN"/>
-        </w:rPr>
-        <w:tab/>
-        <w:t xml:space="preserve">B.Tech   </w:t>
-      </w:r>
-    </w:p>
-    <w:p>
-      <w:pPr>
-        <w:widowControl w:val="0"/>
-        <w:pBdr>
-          <w:top w:val="nil"/>
-          <w:left w:val="nil"/>
-          <w:bottom w:val="nil"/>
-          <w:right w:val="nil"/>
-          <w:between w:val="nil"/>
-        </w:pBdr>
-        <w:spacing w:before="123"/>
-        <w:rPr>
-          <w:color w:val="000000"/>
-          <w:lang w:val="en-IN" w:eastAsia="en-IN" w:bidi="mr-IN"/>
-        </w:rPr>
-      </w:pPr>
-    </w:p>
-    <w:p>
-      <w:pPr>
-        <w:widowControl w:val="0"/>
-        <w:numPr>
-          <w:ilvl w:val="0"/>
-          <w:numId w:val="1"/>
-        </w:numPr>
-        <w:pBdr>
-          <w:top w:val="nil"/>
-          <w:left w:val="nil"/>
-          <w:bottom w:val="nil"/>
-          <w:right w:val="nil"/>
-          <w:between w:val="nil"/>
-        </w:pBdr>
-        <w:tabs>
-          <w:tab w:val="left" w:pos="588"/>
-          <w:tab w:val="left" w:pos="6633"/>
-        </w:tabs>
-        <w:ind w:left="588"/>
-        <w:rPr>
-          <w:rFonts w:ascii="Calibri" w:eastAsia="Calibri" w:hAnsi="Calibri" w:cs="Calibri"/>
-          <w:color w:val="000000"/>
-          <w:lang w:val="en-IN" w:eastAsia="en-IN" w:bidi="mr-IN"/>
-        </w:rPr>
-      </w:pPr>
-      <w:r>
-        <w:rPr>
-          <w:rFonts w:ascii="Calibri" w:eastAsia="Calibri" w:hAnsi="Calibri" w:cs="Calibri"/>
-          <w:color w:val="000000"/>
-          <w:lang w:val="en-IN" w:eastAsia="en-IN" w:bidi="mr-IN"/>
-        </w:rPr>
-        <w:t>Working and Teaching experience of the Guide :</w:t>
-      </w:r>
-      <w:r>
-        <w:rPr>
-          <w:rFonts w:ascii="Calibri" w:eastAsia="Calibri" w:hAnsi="Calibri" w:cs="Calibri"/>
-          <w:color w:val="000000"/>
-          <w:lang w:val="en-IN" w:eastAsia="en-IN" w:bidi="mr-IN"/>
-        </w:rPr>
-        <w:tab/>
-      </w:r>
-      <w:r>
-        <w:rPr>
-          <w:rFonts w:ascii="Calibri" w:eastAsia="Calibri" w:hAnsi="Calibri" w:cs="Calibri"/>
-          <w:b/>
-          <w:bCs/>
-          <w:color w:val="000000"/>
-          <w:lang w:val="en-IN" w:eastAsia="en-IN" w:bidi="mr-IN"/>
-        </w:rPr>
-        <w:t>…….Years</w:t>
-      </w:r>
-    </w:p>
-    <w:p>
-      <w:pPr>
-        <w:widowControl w:val="0"/>
-        <w:numPr>
-          <w:ilvl w:val="0"/>
-          <w:numId w:val="1"/>
-        </w:numPr>
-        <w:pBdr>
-          <w:top w:val="nil"/>
-          <w:left w:val="nil"/>
-          <w:bottom w:val="nil"/>
-          <w:right w:val="nil"/>
-          <w:between w:val="nil"/>
-        </w:pBdr>
-        <w:tabs>
-          <w:tab w:val="left" w:pos="588"/>
-        </w:tabs>
-        <w:spacing w:before="22"/>
-        <w:ind w:left="588"/>
-        <w:rPr>
-          <w:rFonts w:ascii="Calibri" w:eastAsia="Calibri" w:hAnsi="Calibri" w:cs="Calibri"/>
-          <w:color w:val="000000"/>
-          <w:lang w:val="en-IN" w:eastAsia="en-IN" w:bidi="mr-IN"/>
-        </w:rPr>
-      </w:pPr>
-      <w:r>
-        <w:rPr>
-          <w:rFonts w:ascii="Calibri" w:eastAsia="Calibri" w:hAnsi="Calibri" w:cs="Calibri"/>
-          <w:color w:val="000000"/>
-          <w:lang w:val="en-IN" w:eastAsia="en-IN" w:bidi="mr-IN"/>
-        </w:rPr>
-        <w:t>Software used in the Project:</w:t>
-      </w:r>
-    </w:p>
-    <w:p>
-      <w:pPr>
-        <w:widowControl w:val="0"/>
-        <w:numPr>
-          <w:ilvl w:val="0"/>
-          <w:numId w:val="2"/>
-        </w:numPr>
-        <w:pBdr>
-          <w:top w:val="nil"/>
-          <w:left w:val="nil"/>
-          <w:bottom w:val="nil"/>
-          <w:right w:val="nil"/>
-          <w:between w:val="nil"/>
-        </w:pBdr>
-        <w:tabs>
-          <w:tab w:val="left" w:pos="6633"/>
-        </w:tabs>
-        <w:spacing w:before="22"/>
-        <w:ind w:left="6633" w:hanging="358"/>
-        <w:rPr>
-          <w:rFonts w:ascii="Calibri" w:eastAsia="Calibri" w:hAnsi="Calibri" w:cs="Calibri"/>
-          <w:color w:val="000000"/>
-          <w:sz w:val="22"/>
-          <w:szCs w:val="22"/>
-          <w:lang w:val="en-IN" w:eastAsia="en-IN" w:bidi="mr-IN"/>
-        </w:rPr>
-      </w:pPr>
-      <w:r>
-        <w:rPr>
-          <w:rFonts w:ascii="Calibri" w:eastAsia="Calibri" w:hAnsi="Calibri" w:cs="Calibri"/>
-          <w:b/>
-          <w:bCs/>
-          <w:color w:val="000000"/>
-          <w:lang w:val="en-IN" w:eastAsia="en-IN" w:bidi="mr-IN"/>
-        </w:rPr>
-        <w:t>Python</w:t>
-      </w:r>
-    </w:p>
-    <w:p>
-      <w:pPr>
-        <w:widowControl w:val="0"/>
-        <w:numPr>
-          <w:ilvl w:val="0"/>
-          <w:numId w:val="2"/>
-        </w:numPr>
-        <w:pBdr>
-          <w:top w:val="nil"/>
-          <w:left w:val="nil"/>
-          <w:bottom w:val="nil"/>
-          <w:right w:val="nil"/>
-          <w:between w:val="nil"/>
-        </w:pBdr>
-        <w:tabs>
-          <w:tab w:val="left" w:pos="6633"/>
-        </w:tabs>
-        <w:spacing w:before="22"/>
-        <w:ind w:left="6633" w:hanging="358"/>
-        <w:rPr>
-          <w:rFonts w:ascii="Calibri" w:eastAsia="Calibri" w:hAnsi="Calibri" w:cs="Calibri"/>
-          <w:color w:val="000000"/>
-          <w:sz w:val="22"/>
-          <w:szCs w:val="22"/>
-          <w:lang w:val="en-IN" w:eastAsia="en-IN" w:bidi="mr-IN"/>
-        </w:rPr>
-      </w:pPr>
-      <w:r>
-        <w:rPr>
-          <w:rFonts w:ascii="Calibri" w:eastAsia="Calibri" w:hAnsi="Calibri" w:cs="Calibri"/>
-          <w:b/>
-          <w:bCs/>
-          <w:color w:val="000000"/>
-          <w:lang w:val="en-IN" w:eastAsia="en-IN" w:bidi="mr-IN"/>
-        </w:rPr>
-        <w:t>VS code</w:t>
-      </w:r>
-    </w:p>
-    <w:p>
-      <w:pPr>
-        <w:widowControl w:val="0"/>
-        <w:numPr>
-          <w:ilvl w:val="0"/>
-          <w:numId w:val="2"/>
-        </w:numPr>
-        <w:pBdr>
-          <w:top w:val="nil"/>
-          <w:left w:val="nil"/>
-          <w:bottom w:val="nil"/>
-          <w:right w:val="nil"/>
-          <w:between w:val="nil"/>
-        </w:pBdr>
-        <w:tabs>
-          <w:tab w:val="left" w:pos="6633"/>
-        </w:tabs>
-        <w:spacing w:before="22"/>
-        <w:ind w:left="6633" w:hanging="358"/>
-        <w:rPr>
-          <w:rFonts w:ascii="Calibri" w:eastAsia="Calibri" w:hAnsi="Calibri" w:cs="Calibri"/>
-          <w:color w:val="000000"/>
-          <w:sz w:val="22"/>
-          <w:szCs w:val="22"/>
-          <w:lang w:val="en-IN" w:eastAsia="en-IN" w:bidi="mr-IN"/>
-        </w:rPr>
-      </w:pPr>
-      <w:r>
-        <w:rPr>
-          <w:rFonts w:ascii="Calibri" w:eastAsia="Calibri" w:hAnsi="Calibri" w:cs="Calibri"/>
-          <w:b/>
-          <w:bCs/>
-          <w:color w:val="000000"/>
-          <w:lang w:val="en-IN" w:eastAsia="en-IN" w:bidi="mr-IN"/>
-        </w:rPr>
-        <w:t>FastAPI</w:t>
-      </w:r>
-    </w:p>
-    <w:p>
-      <w:pPr>
-        <w:widowControl w:val="0"/>
-        <w:numPr>
-          <w:ilvl w:val="0"/>
-          <w:numId w:val="2"/>
-        </w:numPr>
-        <w:pBdr>
-          <w:top w:val="nil"/>
-          <w:left w:val="nil"/>
-          <w:bottom w:val="nil"/>
-          <w:right w:val="nil"/>
-          <w:between w:val="nil"/>
-        </w:pBdr>
-        <w:tabs>
-          <w:tab w:val="left" w:pos="6633"/>
-        </w:tabs>
-        <w:spacing w:before="22"/>
-        <w:ind w:left="6633" w:hanging="358"/>
-        <w:rPr>
-          <w:rFonts w:ascii="Calibri" w:eastAsia="Calibri" w:hAnsi="Calibri" w:cs="Calibri"/>
-          <w:color w:val="000000"/>
-          <w:sz w:val="22"/>
-          <w:szCs w:val="22"/>
-          <w:lang w:val="en-IN" w:eastAsia="en-IN" w:bidi="mr-IN"/>
-        </w:rPr>
-      </w:pPr>
-      <w:r>
-        <w:rPr>
-          <w:rFonts w:ascii="Calibri" w:eastAsia="Calibri" w:hAnsi="Calibri" w:cs="Calibri"/>
-          <w:b/>
-          <w:bCs/>
-          <w:color w:val="000000"/>
-          <w:lang w:val="en-IN" w:eastAsia="en-IN" w:bidi="mr-IN"/>
-        </w:rPr>
-        <w:t>Langchain &amp; Langgraph</w:t>
-      </w:r>
-    </w:p>
-    <w:p>
-      <w:pPr>
-        <w:widowControl w:val="0"/>
-        <w:pBdr>
-          <w:top w:val="nil"/>
-          <w:left w:val="nil"/>
-          <w:bottom w:val="nil"/>
-          <w:right w:val="nil"/>
-          <w:between w:val="nil"/>
-        </w:pBdr>
-        <w:rPr>
-          <w:b/>
-          <w:bCs/>
-          <w:color w:val="000000"/>
-          <w:lang w:val="en-IN" w:eastAsia="en-IN" w:bidi="mr-IN"/>
-        </w:rPr>
-      </w:pPr>
-    </w:p>
-    <w:p>
-      <w:pPr>
-        <w:widowControl w:val="0"/>
-        <w:pBdr>
-          <w:top w:val="nil"/>
-          <w:left w:val="nil"/>
-          <w:bottom w:val="nil"/>
-          <w:right w:val="nil"/>
-          <w:between w:val="nil"/>
-        </w:pBdr>
-        <w:rPr>
-          <w:b/>
-          <w:bCs/>
-          <w:color w:val="000000"/>
-          <w:lang w:val="en-IN" w:eastAsia="en-IN" w:bidi="mr-IN"/>
-        </w:rPr>
-      </w:pPr>
-      <w:r>
-        <w:rPr>
-          <w:noProof/>
-        </w:rPr>
-        <w:drawing>
-          <wp:anchor distT="0" distB="0" distL="114300" distR="114300" simplePos="0" relativeHeight="251664384" behindDoc="0" locked="0" layoutInCell="1" allowOverlap="1" wp14:anchorId="7525F4A6" wp14:editId="4C2787BA">
-            <wp:simplePos x="0" y="0"/>
-            <wp:positionH relativeFrom="column">
-              <wp:posOffset>3528060</wp:posOffset>
-            </wp:positionH>
-            <wp:positionV relativeFrom="paragraph">
-              <wp:posOffset>75565</wp:posOffset>
-            </wp:positionV>
-            <wp:extent cx="2247900" cy="419100"/>
-            <wp:effectExtent l="0" t="0" r="0" b="0"/>
-            <wp:wrapNone/>
-            <wp:docPr id="1205180691" name="Picture 2"/>
-            <wp:cNvGraphicFramePr>
-              <a:graphicFrameLocks xmlns:a="http://schemas.openxmlformats.org/drawingml/2006/main" noChangeAspect="1"/>
-            </wp:cNvGraphicFramePr>
-            <a:graphic xmlns:a="http://schemas.openxmlformats.org/drawingml/2006/main">
-              <a:graphicData uri="http://schemas.openxmlformats.org/drawingml/2006/picture">
-                <pic:pic xmlns:pic="http://schemas.openxmlformats.org/drawingml/2006/picture">
-                  <pic:nvPicPr>
-                    <pic:cNvPr id="1205180691" name="Picture 84980815"/>
-                    <pic:cNvPicPr/>
-                  </pic:nvPicPr>
-                  <pic:blipFill>
-                    <a:blip r:embed="rId9"/>
-                    <a:stretch>
-                      <a:fillRect/>
-                    </a:stretch>
-                  </pic:blipFill>
-                  <pic:spPr>
-                    <a:xfrm>
-                      <a:off x="0" y="0"/>
-                      <a:ext cx="2247900" cy="419100"/>
-                    </a:xfrm>
-                    <a:prstGeom prst="rect">
-                      <a:avLst/>
-                    </a:prstGeom>
-                  </pic:spPr>
-                </pic:pic>
-              </a:graphicData>
-            </a:graphic>
-          </wp:anchor>
-        </w:drawing>
-      </w:r>
-    </w:p>
-    <w:p>
-      <w:pPr>
-        <w:widowControl w:val="0"/>
-        <w:pBdr>
-          <w:top w:val="nil"/>
-          <w:left w:val="nil"/>
-          <w:bottom w:val="nil"/>
-          <w:right w:val="nil"/>
-          <w:between w:val="nil"/>
-        </w:pBdr>
-        <w:spacing w:before="149"/>
-        <w:rPr>
-          <w:b/>
-          <w:bCs/>
-          <w:color w:val="000000"/>
-          <w:lang w:val="en-IN" w:eastAsia="en-IN" w:bidi="mr-IN"/>
-        </w:rPr>
-      </w:pPr>
-    </w:p>
-    <w:p>
-      <w:pPr>
-        <w:spacing w:before="1" w:after="160" w:line="362" w:lineRule="auto"/>
-        <w:ind w:left="5914" w:right="2243"/>
-        <w:rPr>
-          <w:rFonts w:ascii="Calibri" w:eastAsia="Calibri" w:hAnsi="Calibri" w:cs="Calibri"/>
-          <w:lang w:val="en-IN" w:eastAsia="en-IN" w:bidi="mr-IN"/>
-        </w:rPr>
-      </w:pPr>
-      <w:r>
-        <w:rPr>
-          <w:rFonts w:ascii="Calibri" w:eastAsia="Calibri" w:hAnsi="Calibri" w:cs="Calibri"/>
-          <w:lang w:val="en-IN" w:eastAsia="en-IN" w:bidi="mr-IN"/>
-        </w:rPr>
-        <w:t>Signature of the Guide Date:</w:t>
-      </w:r>
-      <w:r>
-        <w:rPr>
-          <w:rFonts w:ascii="Calibri" w:eastAsia="Calibri" w:hAnsi="Calibri" w:cs="Calibri"/>
-          <w:lang w:val="en-IN" w:eastAsia="en-IN" w:bidi="mr-IN"/>
-        </w:rPr>
-        <w:t>30-09-2026</w:t>
-      </w:r>
-    </w:p>
-    <w:p>
-      <w:pPr>
-        <w:spacing w:before="2" w:after="160" w:line="362" w:lineRule="auto"/>
-        <w:ind w:left="5914" w:right="1000"/>
-        <w:rPr>
-          <w:rFonts w:ascii="Calibri" w:eastAsia="Calibri" w:hAnsi="Calibri" w:cs="Calibri"/>
-          <w:b/>
-          <w:bCs/>
-          <w:lang w:val="en-IN" w:eastAsia="en-IN" w:bidi="mr-IN"/>
-        </w:rPr>
-      </w:pPr>
-      <w:r>
-        <w:rPr>
-          <w:rFonts w:ascii="Calibri" w:eastAsia="Calibri" w:hAnsi="Calibri" w:cs="Calibri"/>
-          <w:b/>
-          <w:bCs/>
-          <w:lang w:val="en-IN" w:eastAsia="en-IN" w:bidi="mr-IN"/>
-        </w:rPr>
-        <w:t>Name: Mr. Mahendra Datta    Subject Matter Expert</w:t>
-      </w:r>
-    </w:p>
-    <w:p>
-      <w:pPr>
-        <w:spacing w:before="2" w:after="160" w:line="362" w:lineRule="auto"/>
-        <w:ind w:left="5914" w:right="946"/>
-        <w:rPr>
-          <w:rFonts w:ascii="Calibri" w:eastAsia="Calibri" w:hAnsi="Calibri" w:cs="Calibri"/>
-          <w:lang w:val="en-IN" w:eastAsia="en-IN" w:bidi="mr-IN"/>
-        </w:rPr>
-      </w:pPr>
-      <w:r>
-        <w:rPr>
-          <w:rFonts w:ascii="Calibri" w:eastAsia="Calibri" w:hAnsi="Calibri" w:cs="Calibri"/>
-          <w:lang w:val="en-IN" w:eastAsia="en-IN" w:bidi="mr-IN"/>
-        </w:rPr>
-        <w:t>Signature, Designation, Stamp of the Project Proposal Evalua</w:t>
-      </w:r>
-      <w:r>
-        <w:rPr>
-          <w:noProof/>
-        </w:rPr>
-        <w:drawing>
-          <wp:anchor distT="0" distB="0" distL="0" distR="0" simplePos="0" relativeHeight="251661312" behindDoc="0" locked="0" layoutInCell="1" allowOverlap="1" wp14:anchorId="238EDB7D" wp14:editId="3A8719FC">
-            <wp:simplePos x="0" y="0"/>
-            <wp:positionH relativeFrom="column">
-              <wp:posOffset>1812289</wp:posOffset>
-            </wp:positionH>
-            <wp:positionV relativeFrom="paragraph">
-              <wp:posOffset>466810</wp:posOffset>
-            </wp:positionV>
-            <wp:extent cx="1352550" cy="295275"/>
-            <wp:effectExtent l="0" t="0" r="0" b="0"/>
-            <wp:wrapNone/>
-            <wp:docPr id="40" name="image37.png"/>
-            <wp:cNvGraphicFramePr/>
-            <a:graphic xmlns:a="http://schemas.openxmlformats.org/drawingml/2006/main">
-              <a:graphicData uri="http://schemas.openxmlformats.org/drawingml/2006/picture">
-                <pic:pic xmlns:pic="http://schemas.openxmlformats.org/drawingml/2006/picture">
-                  <pic:nvPicPr>
-                    <pic:cNvPr id="40" name="image37.png"/>
-                    <pic:cNvPicPr/>
-                  </pic:nvPicPr>
-                  <pic:blipFill>
-                    <a:blip r:embed="rId11"/>
-                    <a:stretch>
-                      <a:fillRect/>
-                    </a:stretch>
-                  </pic:blipFill>
-                  <pic:spPr>
-                    <a:xfrm>
-                      <a:off x="0" y="0"/>
-                      <a:ext cx="1352550" cy="295275"/>
-                    </a:xfrm>
-                    <a:prstGeom prst="rect">
-                      <a:avLst/>
-                    </a:prstGeom>
-                  </pic:spPr>
-                </pic:pic>
-              </a:graphicData>
-            </a:graphic>
-          </wp:anchor>
-        </w:drawing>
-      </w:r>
-      <w:r>
-        <w:rPr>
-          <w:noProof/>
-        </w:rPr>
-        <w:drawing>
-          <wp:anchor distT="0" distB="0" distL="0" distR="0" simplePos="0" relativeHeight="251662336" behindDoc="0" locked="0" layoutInCell="1" allowOverlap="1" wp14:anchorId="6BFCAEA3" wp14:editId="57C4981A">
-            <wp:simplePos x="0" y="0"/>
-            <wp:positionH relativeFrom="column">
-              <wp:posOffset>412115</wp:posOffset>
-            </wp:positionH>
-            <wp:positionV relativeFrom="paragraph">
-              <wp:posOffset>457285</wp:posOffset>
-            </wp:positionV>
-            <wp:extent cx="1085849" cy="314325"/>
-            <wp:effectExtent l="0" t="0" r="0" b="0"/>
-            <wp:wrapNone/>
-            <wp:docPr id="23" name="image2.png"/>
-            <wp:cNvGraphicFramePr/>
-            <a:graphic xmlns:a="http://schemas.openxmlformats.org/drawingml/2006/main">
-              <a:graphicData uri="http://schemas.openxmlformats.org/drawingml/2006/picture">
-                <pic:pic xmlns:pic="http://schemas.openxmlformats.org/drawingml/2006/picture">
-                  <pic:nvPicPr>
-                    <pic:cNvPr id="23" name="image2.png"/>
-                    <pic:cNvPicPr/>
-                  </pic:nvPicPr>
-                  <pic:blipFill>
-                    <a:blip r:embed="rId12"/>
-                    <a:stretch>
-                      <a:fillRect/>
-                    </a:stretch>
-                  </pic:blipFill>
-                  <pic:spPr>
-                    <a:xfrm>
-                      <a:off x="0" y="0"/>
-                      <a:ext cx="1085849" cy="314325"/>
-                    </a:xfrm>
-                    <a:prstGeom prst="rect">
-                      <a:avLst/>
-                    </a:prstGeom>
-                  </pic:spPr>
-                </pic:pic>
-              </a:graphicData>
-            </a:graphic>
-          </wp:anchor>
-        </w:drawing>
-      </w:r>
-      <w:r>
-        <w:rPr>
-          <w:rFonts w:ascii="Calibri" w:eastAsia="Calibri" w:hAnsi="Calibri" w:cs="Calibri"/>
-          <w:lang w:val="en-IN" w:eastAsia="en-IN" w:bidi="mr-IN"/>
-        </w:rPr>
-        <w:t>tion</w:t>
+        <w:t>t.</w:t>
       </w:r>
     </w:p>
     <w:p>
@@ -2268,7 +1308,6 @@
           <w:sz w:val="34"/>
           <w:szCs w:val="28"/>
         </w:rPr>
-        <w:lastRenderedPageBreak/>
         <w:t>Abstract</w:t>
       </w:r>
     </w:p>
@@ -2337,7 +1376,7 @@
           <w:color w:val="222833"/>
           <w:szCs w:val="22"/>
         </w:rPr>
-        <w:t xml:space="preserve">The results indicate that the multi-agent stage materially improves answer quality over single-pass generation: the CriticAgent reliably identifies unsupported claims that the DebateAgent surfaces, and the JudgeAgent's revision step measurably raises both structural completeness and citation coverage. The principal limitations are latency — five sequential model calls per question — dependence on a single LLM provider, and the absence of a persistent user and document store, which are identified as the priority targets for future work. The project </w:t>
+        <w:t xml:space="preserve">The results indicate that the multi-agent stage materially improves answer quality over single-pass generation: the CriticAgent reliably identifies unsupported claims that the DebateAgent surfaces, and the JudgeAgent's revision step measurably raises both structural completeness and citation coverage. The principal limitations are latency — five sequential model calls per </w:t>
       </w:r>
       <w:r>
         <w:rPr>
@@ -2345,7 +1384,7 @@
           <w:szCs w:val="22"/>
         </w:rPr>
         <w:lastRenderedPageBreak/>
-        <w:t>demonstrates that agent orchestration is a practical and auditable mechanism for converting an unverifiable language model into an accountable reasoning system.</w:t>
+        <w:t>question — dependence on a single LLM provider, and the absence of a persistent user and document store, which are identified as the priority targets for future work. The project demonstrates that agent orchestration is a practical and auditable mechanism for converting an unverifiable language model into an accountable reasoning system.</w:t>
       </w:r>
     </w:p>
     <w:p>
@@ -10680,7 +9719,7 @@
                     <pic:cNvPicPr/>
                   </pic:nvPicPr>
                   <pic:blipFill>
-                    <a:blip r:embed="rId13"/>
+                    <a:blip r:embed="rId10"/>
                     <a:stretch>
                       <a:fillRect/>
                     </a:stretch>
@@ -11478,7 +10517,7 @@
                     <pic:cNvPicPr/>
                   </pic:nvPicPr>
                   <pic:blipFill>
-                    <a:blip r:embed="rId14"/>
+                    <a:blip r:embed="rId11"/>
                     <a:stretch>
                       <a:fillRect/>
                     </a:stretch>
@@ -13098,7 +12137,7 @@
                     <pic:cNvPicPr/>
                   </pic:nvPicPr>
                   <pic:blipFill>
-                    <a:blip r:embed="rId15"/>
+                    <a:blip r:embed="rId12"/>
                     <a:stretch>
                       <a:fillRect/>
                     </a:stretch>
@@ -13572,7 +12611,7 @@
                     <pic:cNvPicPr/>
                   </pic:nvPicPr>
                   <pic:blipFill>
-                    <a:blip r:embed="rId16"/>
+                    <a:blip r:embed="rId13"/>
                     <a:stretch>
                       <a:fillRect/>
                     </a:stretch>
@@ -15171,7 +14210,7 @@
                     <pic:cNvPicPr/>
                   </pic:nvPicPr>
                   <pic:blipFill>
-                    <a:blip r:embed="rId17"/>
+                    <a:blip r:embed="rId14"/>
                     <a:stretch>
                       <a:fillRect/>
                     </a:stretch>
@@ -15424,7 +14463,7 @@
                     <pic:cNvPicPr/>
                   </pic:nvPicPr>
                   <pic:blipFill>
-                    <a:blip r:embed="rId18"/>
+                    <a:blip r:embed="rId15"/>
                     <a:stretch>
                       <a:fillRect/>
                     </a:stretch>
@@ -17600,7 +16639,7 @@
                     <pic:cNvPicPr/>
                   </pic:nvPicPr>
                   <pic:blipFill>
-                    <a:blip r:embed="rId19"/>
+                    <a:blip r:embed="rId16"/>
                     <a:stretch>
                       <a:fillRect/>
                     </a:stretch>
@@ -19833,7 +18872,7 @@
                     <pic:cNvPicPr/>
                   </pic:nvPicPr>
                   <pic:blipFill>
-                    <a:blip r:embed="rId20"/>
+                    <a:blip r:embed="rId17"/>
                     <a:stretch>
                       <a:fillRect/>
                     </a:stretch>
@@ -21158,7 +20197,7 @@
                     <pic:cNvPicPr/>
                   </pic:nvPicPr>
                   <pic:blipFill>
-                    <a:blip r:embed="rId21"/>
+                    <a:blip r:embed="rId18"/>
                     <a:stretch>
                       <a:fillRect/>
                     </a:stretch>
@@ -30304,12 +29343,12 @@
       </w:r>
     </w:p>
     <w:sectPr>
-      <w:headerReference w:type="even" r:id="rId22"/>
-      <w:headerReference w:type="default" r:id="rId23"/>
-      <w:footerReference w:type="even" r:id="rId24"/>
-      <w:footerReference w:type="default" r:id="rId25"/>
-      <w:headerReference w:type="first" r:id="rId26"/>
-      <w:footerReference w:type="first" r:id="rId27"/>
+      <w:headerReference w:type="even" r:id="rId19"/>
+      <w:headerReference w:type="default" r:id="rId20"/>
+      <w:footerReference w:type="even" r:id="rId21"/>
+      <w:footerReference w:type="default" r:id="rId22"/>
+      <w:headerReference w:type="first" r:id="rId23"/>
+      <w:footerReference w:type="first" r:id="rId24"/>
       <w:pgSz w:w="12240" w:h="15840"/>
       <w:pgMar w:top="1440" w:right="1440" w:bottom="1440" w:left="1656" w:header="720" w:footer="720" w:gutter="0"/>
       <w:cols w:space="720"/>

</xml_diff>